<commit_message>
Update resume with Corpus project
Co-Authored-By: Claude Opus 5.5 <noreply@anthropic.com>
</commit_message>
<xml_diff>
--- a/public/Aditya_Malviya_Senior_Data_Engineer.docx
+++ b/public/Aditya_Malviya_Senior_Data_Engineer.docx
@@ -648,6 +648,54 @@
           <w:i w:val="0"/>
           <w:sz w:val="20"/>
         </w:rPr>
+        <w:t xml:space="preserve">Corpus – Document AI and Data Q&amp;A Workspace (Oct 2026 – Present): </w:t>
+      </w:r>
+      <w:r>
+        <w:rPr>
+          <w:rFonts w:ascii="Calibri" w:hAnsi="Calibri"/>
+          <w:sz w:val="20"/>
+        </w:rPr>
+        <w:t xml:space="preserve">Browser-native RAG app with hybrid BM25 + vector retrieval, intent routing and sentence-level citations, running Gemma 4 on WebGPU; turns questions about CSV/Parquet files into guarded DuckDB SQL and scores retrieval with hit@k and MRR. </w:t>
+      </w:r>
+      <w:hyperlink r:id="rId23">
+        <w:r>
+          <w:rPr>
+            <w:color w:val="1F3A5F"/>
+            <w:u w:val="single"/>
+          </w:rPr>
+          <w:t xml:space="preserve">Live</w:t>
+        </w:r>
+      </w:hyperlink>
+      <w:r>
+        <w:rPr>
+          <w:rFonts w:ascii="Calibri" w:hAnsi="Calibri"/>
+          <w:sz w:val="20"/>
+        </w:rPr>
+        <w:t xml:space="preserve"> | </w:t>
+      </w:r>
+      <w:hyperlink r:id="rId24">
+        <w:r>
+          <w:rPr>
+            <w:color w:val="1F3A5F"/>
+            <w:u w:val="single"/>
+          </w:rPr>
+          <w:t xml:space="preserve">GitHub</w:t>
+        </w:r>
+      </w:hyperlink>
+    </w:p>
+    <w:p>
+      <w:pPr>
+        <w:pStyle w:val="ListBullet"/>
+        <w:spacing w:after="20" w:before="0"/>
+        <w:ind w:left="317" w:hanging="230"/>
+      </w:pPr>
+      <w:r>
+        <w:rPr>
+          <w:rFonts w:ascii="Calibri" w:hAnsi="Calibri"/>
+          <w:b/>
+          <w:i w:val="0"/>
+          <w:sz w:val="20"/>
+        </w:rPr>
         <w:t xml:space="preserve">FlowForge – Visual ETL Pipeline Builder (Oct 2026 – Present): </w:t>
       </w:r>
       <w:r>

</xml_diff>

<commit_message>
Add Orchestra project with walkthrough, case study and updated resume
Co-Authored-By: Claude Opus 5.5 <noreply@anthropic.com>
</commit_message>
<xml_diff>
--- a/public/Aditya_Malviya_Senior_Data_Engineer.docx
+++ b/public/Aditya_Malviya_Senior_Data_Engineer.docx
@@ -696,6 +696,54 @@
           <w:i w:val="0"/>
           <w:sz w:val="20"/>
         </w:rPr>
+        <w:t xml:space="preserve">Orchestra – Pipeline Orchestrator and Run Doctor (Oct 2026 – Present): </w:t>
+      </w:r>
+      <w:r>
+        <w:rPr>
+          <w:rFonts w:ascii="Calibri" w:hAnsi="Calibri"/>
+          <w:sz w:val="20"/>
+        </w:rPr>
+        <w:t xml:space="preserve">Airflow-style scheduler on a simulated clock with cron, catch-up, retries with exponential backoff, pools, trigger rules, SLAs and idempotent backfills; diagnoses failures (root cause vs blast radius) and exports DAGs to Apache Airflow 2. </w:t>
+      </w:r>
+      <w:hyperlink r:id="rId25">
+        <w:r>
+          <w:rPr>
+            <w:color w:val="1F3A5F"/>
+            <w:u w:val="single"/>
+          </w:rPr>
+          <w:t xml:space="preserve">Live</w:t>
+        </w:r>
+      </w:hyperlink>
+      <w:r>
+        <w:rPr>
+          <w:rFonts w:ascii="Calibri" w:hAnsi="Calibri"/>
+          <w:sz w:val="20"/>
+        </w:rPr>
+        <w:t xml:space="preserve"> | </w:t>
+      </w:r>
+      <w:hyperlink r:id="rId26">
+        <w:r>
+          <w:rPr>
+            <w:color w:val="1F3A5F"/>
+            <w:u w:val="single"/>
+          </w:rPr>
+          <w:t xml:space="preserve">GitHub</w:t>
+        </w:r>
+      </w:hyperlink>
+    </w:p>
+    <w:p>
+      <w:pPr>
+        <w:pStyle w:val="ListBullet"/>
+        <w:spacing w:after="20" w:before="0"/>
+        <w:ind w:left="317" w:hanging="230"/>
+      </w:pPr>
+      <w:r>
+        <w:rPr>
+          <w:rFonts w:ascii="Calibri" w:hAnsi="Calibri"/>
+          <w:b/>
+          <w:i w:val="0"/>
+          <w:sz w:val="20"/>
+        </w:rPr>
         <w:t xml:space="preserve">FlowForge – Visual ETL Pipeline Builder (Oct 2026 – Present): </w:t>
       </w:r>
       <w:r>

</xml_diff>

<commit_message>
Update resume with RepoReel project
Co-Authored-By: Claude Opus 5.5 <noreply@anthropic.com>
</commit_message>
<xml_diff>
--- a/public/Aditya_Malviya_Senior_Data_Engineer.docx
+++ b/public/Aditya_Malviya_Senior_Data_Engineer.docx
@@ -648,6 +648,54 @@
           <w:i w:val="0"/>
           <w:sz w:val="20"/>
         </w:rPr>
+        <w:t xml:space="preserve">RepoReel – Reel-First Repository Search (Oct 2026 – Present): </w:t>
+      </w:r>
+      <w:r>
+        <w:rPr>
+          <w:rFonts w:ascii="Calibri" w:hAnsi="Calibri"/>
+          <w:sz w:val="20"/>
+        </w:rPr>
+        <w:t xml:space="preserve">Free nightly data pipeline (Python, DuckDB, fastembed, GitHub Actions) that finds English Instagram reels about GitHub repos, matches each to its repo via captions, cover OCR and GitHub search, and publishes sharded static data within free tiers; 411 reels, searchable by meaning. </w:t>
+      </w:r>
+      <w:hyperlink r:id="rId27">
+        <w:r>
+          <w:rPr>
+            <w:color w:val="1F3A5F"/>
+            <w:u w:val="single"/>
+          </w:rPr>
+          <w:t xml:space="preserve">Live</w:t>
+        </w:r>
+      </w:hyperlink>
+      <w:r>
+        <w:rPr>
+          <w:rFonts w:ascii="Calibri" w:hAnsi="Calibri"/>
+          <w:sz w:val="20"/>
+        </w:rPr>
+        <w:t xml:space="preserve"> | </w:t>
+      </w:r>
+      <w:hyperlink r:id="rId28">
+        <w:r>
+          <w:rPr>
+            <w:color w:val="1F3A5F"/>
+            <w:u w:val="single"/>
+          </w:rPr>
+          <w:t xml:space="preserve">GitHub</w:t>
+        </w:r>
+      </w:hyperlink>
+    </w:p>
+    <w:p>
+      <w:pPr>
+        <w:pStyle w:val="ListBullet"/>
+        <w:spacing w:after="20" w:before="0"/>
+        <w:ind w:left="317" w:hanging="230"/>
+      </w:pPr>
+      <w:r>
+        <w:rPr>
+          <w:rFonts w:ascii="Calibri" w:hAnsi="Calibri"/>
+          <w:b/>
+          <w:i w:val="0"/>
+          <w:sz w:val="20"/>
+        </w:rPr>
         <w:t xml:space="preserve">Corpus – Document AI and Data Q&amp;A Workspace (Oct 2026 – Present): </w:t>
       </w:r>
       <w:r>

</xml_diff>